<commit_message>
Open with the introduction, as the framework orders it
The game now runs Start -> Rules -> the Hook -> Map (framework 3.1-3.2).
Start is the introduction: it says this is a mystery game for practicing
HEAR and shows the four HEAR moves; the Rules follow, then the Hook.
New game text: start.intro, start.hear_title, start.hear_note, start.next,
rules.next, hook.next.

Packet: headings and labels now use the framework's terms (the CCC,
the Hook, Situation, Assignment, Position on the CCC, Clues, Red Herrings,
Response Matrix).

Co-Authored-By: Claude Opus 5.5 <noreply@anthropic.com>
</commit_message>
<xml_diff>
--- a/scenario/The Commons' Comma – Scenario Packet.docx
+++ b/scenario/The Commons' Comma – Scenario Packet.docx
@@ -465,7 +465,7 @@
           <w:vertAlign w:val="baseline"/>
           <w:rtl w:val="0"/>
         </w:rPr>
-        <w:t xml:space="preserve">Pitch:</w:t>
+        <w:t xml:space="preserve">Summary:</w:t>
       </w:r>
       <w:r>
         <w:rPr>
@@ -948,7 +948,7 @@
         <w:rPr>
           <w:rtl w:val="0"/>
         </w:rPr>
-        <w:t xml:space="preserve">3. The controversy</w:t>
+        <w:t xml:space="preserve">3. The CCC (Current Campus Controversy)</w:t>
       </w:r>
     </w:p>
     <w:p>
@@ -1203,7 +1203,7 @@
           <w:vertAlign w:val="baseline"/>
           <w:rtl w:val="0"/>
         </w:rPr>
-        <w:t xml:space="preserve">The eight positions.</w:t>
+        <w:t xml:space="preserve">The eight positions on the CCC.</w:t>
       </w:r>
       <w:r>
         <w:rPr>
@@ -1566,7 +1566,7 @@
         <w:rPr>
           <w:rtl w:val="0"/>
         </w:rPr>
-        <w:t xml:space="preserve">4. Setting and briefing</w:t>
+        <w:t xml:space="preserve">4. The Hook</w:t>
       </w:r>
     </w:p>
     <w:p>
@@ -1619,7 +1619,7 @@
           <w:vertAlign w:val="baseline"/>
           <w:rtl w:val="0"/>
         </w:rPr>
-        <w:t xml:space="preserve">Player role.</w:t>
+        <w:t xml:space="preserve">Situation.</w:t>
       </w:r>
       <w:r>
         <w:rPr>
@@ -1691,7 +1691,7 @@
           <w:vertAlign w:val="baseline"/>
           <w:rtl w:val="0"/>
         </w:rPr>
-        <w:t xml:space="preserve">Briefing (the president speaks).</w:t>
+        <w:t xml:space="preserve">Assignment (the president speaks).</w:t>
       </w:r>
       <w:r>
         <w:rPr>
@@ -6646,7 +6646,7 @@
           <w:vertAlign w:val="baseline"/>
           <w:rtl w:val="0"/>
         </w:rPr>
-        <w:t xml:space="preserve">Stance.</w:t>
+        <w:t xml:space="preserve">Position on the CCC.</w:t>
       </w:r>
       <w:r>
         <w:rPr>
@@ -7246,7 +7246,7 @@
           <w:vertAlign w:val="baseline"/>
           <w:rtl w:val="0"/>
         </w:rPr>
-        <w:t xml:space="preserve">Stance.</w:t>
+        <w:t xml:space="preserve">Position on the CCC.</w:t>
       </w:r>
       <w:r>
         <w:rPr>
@@ -7846,7 +7846,7 @@
           <w:vertAlign w:val="baseline"/>
           <w:rtl w:val="0"/>
         </w:rPr>
-        <w:t xml:space="preserve">Stance.</w:t>
+        <w:t xml:space="preserve">Position on the CCC.</w:t>
       </w:r>
       <w:r>
         <w:rPr>
@@ -8446,7 +8446,7 @@
           <w:vertAlign w:val="baseline"/>
           <w:rtl w:val="0"/>
         </w:rPr>
-        <w:t xml:space="preserve">Stance.</w:t>
+        <w:t xml:space="preserve">Position on the CCC.</w:t>
       </w:r>
       <w:r>
         <w:rPr>
@@ -9046,7 +9046,7 @@
           <w:vertAlign w:val="baseline"/>
           <w:rtl w:val="0"/>
         </w:rPr>
-        <w:t xml:space="preserve">Stance.</w:t>
+        <w:t xml:space="preserve">Position on the CCC.</w:t>
       </w:r>
       <w:r>
         <w:rPr>
@@ -9646,7 +9646,7 @@
           <w:vertAlign w:val="baseline"/>
           <w:rtl w:val="0"/>
         </w:rPr>
-        <w:t xml:space="preserve">Stance.</w:t>
+        <w:t xml:space="preserve">Position on the CCC.</w:t>
       </w:r>
       <w:r>
         <w:rPr>
@@ -10246,7 +10246,7 @@
           <w:vertAlign w:val="baseline"/>
           <w:rtl w:val="0"/>
         </w:rPr>
-        <w:t xml:space="preserve">Stance.</w:t>
+        <w:t xml:space="preserve">Position on the CCC.</w:t>
       </w:r>
       <w:r>
         <w:rPr>
@@ -10846,7 +10846,7 @@
           <w:vertAlign w:val="baseline"/>
           <w:rtl w:val="0"/>
         </w:rPr>
-        <w:t xml:space="preserve">Stance.</w:t>
+        <w:t xml:space="preserve">Position on the CCC.</w:t>
       </w:r>
       <w:r>
         <w:rPr>
@@ -11134,7 +11134,7 @@
         <w:rPr>
           <w:rtl w:val="0"/>
         </w:rPr>
-        <w:t xml:space="preserve">7. The 20 clues</w:t>
+        <w:t xml:space="preserve">7. The 20 Clues</w:t>
       </w:r>
     </w:p>
     <w:p>
@@ -16622,7 +16622,7 @@
         <w:rPr>
           <w:rtl w:val="0"/>
         </w:rPr>
-        <w:t xml:space="preserve">9. The 16 red herrings and their sets</w:t>
+        <w:t xml:space="preserve">9. The 16 Red Herrings and their sets</w:t>
       </w:r>
     </w:p>
     <w:p>
@@ -20904,7 +20904,7 @@
         <w:rPr>
           <w:rtl w:val="0"/>
         </w:rPr>
-        <w:t xml:space="preserve">11. The response matrix</w:t>
+        <w:t xml:space="preserve">11. The Response Matrix</w:t>
       </w:r>
     </w:p>
     <w:p>
@@ -30499,7 +30499,7 @@
         <w:rPr>
           <w:rtl w:val="0"/>
         </w:rPr>
-        <w:t xml:space="preserve">12. Endings, bonus and assets</w:t>
+        <w:t xml:space="preserve">12. The ending, bonus points and assets</w:t>
       </w:r>
     </w:p>
     <w:p>

</xml_diff>